<commit_message>
docs(planning): align timeline with one installation per hospital
Remove the SaaS, tenant and subscription wording from the timeline Markdown and Word file (ADR-023, C-089).
</commit_message>
<xml_diff>
--- a/docs/deliverables/HMS-Core-Modules-and-Development-Timeline.docx
+++ b/docs/deliverables/HMS-Core-Modules-and-Development-Timeline.docx
@@ -810,12 +810,12 @@
         <w:pStyle w:val="Heading2"/>
       </w:pPr>
       <w:r>
-        <w:t>01 SaaS platform and administration</w:t>
+        <w:t>01 Platform and administration</w:t>
       </w:r>
     </w:p>
     <w:p>
       <w:r>
-        <w:t>Tenant and facility setup; module entitlements; users, roles and permissions; login, sessions and MFA; audit history; configuration and numbering; Bangla and English; shared UI; background jobs, request handling and monitoring.</w:t>
+        <w:t>Hospital and facility setup (one installation per hospital, ADR-023); users, roles and permissions; login, sessions and MFA; audit history; configuration and numbering; Bangla and English; shared UI; background jobs, request handling and monitoring.</w:t>
       </w:r>
     </w:p>
     <w:p>
@@ -824,7 +824,7 @@
           <w:color w:val="4A5560"/>
           <w:sz w:val="20"/>
         </w:rPr>
-        <w:t>W1-2, maintained throughout. Foundation for every module. Includes T-FND, T-DB, T-ACC, T-PLT, T-UI and T-I18N work. Commercial suspension and automated subscription billing remain outside the first release. Source C01.</w:t>
+        <w:t>W1-2, maintained throughout. Foundation for every module. Includes T-FND, T-DB, T-ACC, T-PLT, T-UI and T-I18N work. Source C01.</w:t>
       </w:r>
     </w:p>
     <w:p>
@@ -1437,7 +1437,7 @@
               <w:rPr>
                 <w:sz w:val="21"/>
               </w:rPr>
-              <w:t>Complete access, audit, jobs, safe retries and tenant isolation. Validate print prototypes and CI. Obtain operator-owned recovery evidence for RG-1.</w:t>
+              <w:t>Complete access, audit, jobs and safe retries. Validate print prototypes and CI. Obtain operator-owned recovery evidence for RG-1.</w:t>
             </w:r>
           </w:p>
         </w:tc>
@@ -2265,7 +2265,7 @@
               <w:rPr>
                 <w:sz w:val="21"/>
               </w:rPr>
-              <w:t>Medicine returns and approved credits; discharge, final bills, departure and bed cleaning. Public data privacy and tenant-isolation checks.</w:t>
+              <w:t>Medicine returns and approved credits; discharge, final bills, departure and bed cleaning. Public data privacy checks.</w:t>
             </w:r>
           </w:p>
         </w:tc>
@@ -3364,7 +3364,7 @@
     </w:p>
     <w:p>
       <w:r>
-        <w:t>The 20-week envelope excludes autonomous clinical AI, statutory features, multi-facility groups, offline mode, full PACS, automatic subscription billing and unapproved specialty modules. It does not promise full payroll, a general ledger or every third-party adapter. If a module cannot fit, the owner must approve a narrower release slice or extra capacity before its build window. The deadline stays at Week 20; excluded work is recorded separately. AI does not resolve missing policy decisions.</w:t>
+        <w:t>The 20-week envelope excludes autonomous clinical AI, statutory features, multi-facility groups, offline mode, full PACS and unapproved specialty modules. It does not promise full payroll, a general ledger or every third-party adapter. If a module cannot fit, the owner must approve a narrower release slice or extra capacity before its build window. The deadline stays at Week 20; excluded work is recorded separately. AI does not resolve missing policy decisions.</w:t>
       </w:r>
     </w:p>
     <w:p>

</xml_diff>